<commit_message>
feat: Feito Topico 2.1, educacao infantil
</commit_message>
<xml_diff>
--- a/Documentation/DocumentacaoProjeto.DOCX
+++ b/Documentation/DocumentacaoProjeto.DOCX
@@ -3838,7 +3838,7 @@
                 <w:rStyle w:val="Hyperlink"/>
                 <w:noProof/>
               </w:rPr>
-              <w:t>ITUAÇÃO DE PESQUISA OU EMPRESA (OU O QUE O ORIENTADOR DEFINIR)</w:t>
+              <w:t xml:space="preserve">ITUAÇÃO DE PESQUISA OU EMPRESA </w:t>
             </w:r>
             <w:r>
               <w:rPr>
@@ -5619,10 +5619,7 @@
       </w:r>
       <w:proofErr w:type="gramEnd"/>
       <w:r>
-        <w:t xml:space="preserve"> </w:t>
-      </w:r>
-      <w:r>
-        <w:t>Educação Infantil e Tecnologias Digitais</w:t>
+        <w:t xml:space="preserve"> Educação Infantil e Tecnologias Digitais</w:t>
       </w:r>
     </w:p>
     <w:p>
@@ -5635,56 +5632,14 @@
         <w:tab/>
         <w:t xml:space="preserve">A Teoria </w:t>
       </w:r>
+    </w:p>
+    <w:p>
+      <w:pPr>
+        <w:jc w:val="both"/>
+        <w:textAlignment w:val="baseline"/>
+      </w:pPr>
       <w:bookmarkStart w:id="7" w:name="_GoBack"/>
       <w:bookmarkEnd w:id="7"/>
-    </w:p>
-    <w:p>
-      <w:pPr>
-        <w:jc w:val="both"/>
-        <w:textAlignment w:val="baseline"/>
-      </w:pPr>
-      <w:r>
-        <w:t>Segundo</w:t>
-      </w:r>
-      <w:r>
-        <w:t xml:space="preserve"> </w:t>
-      </w:r>
-      <w:r>
-        <w:t>Sandro Vinicius Sales dos Santos</w:t>
-      </w:r>
-      <w:r>
-        <w:t xml:space="preserve">: </w:t>
-      </w:r>
-      <w:r>
-        <w:t xml:space="preserve">“[...] </w:t>
-      </w:r>
-      <w:r>
-        <w:t>as crianças são</w:t>
-      </w:r>
-      <w:r>
-        <w:t xml:space="preserve"> </w:t>
-      </w:r>
-      <w:r>
-        <w:t>consideradas seres sociais mergulhados, desde</w:t>
-      </w:r>
-      <w:r>
-        <w:t xml:space="preserve"> </w:t>
-      </w:r>
-      <w:r>
-        <w:t>cedo, em uma rede social já constituída</w:t>
-      </w:r>
-      <w:r>
-        <w:t>[...]</w:t>
-      </w:r>
-      <w:r>
-        <w:t xml:space="preserve">” </w:t>
-      </w:r>
-    </w:p>
-    <w:p>
-      <w:pPr>
-        <w:jc w:val="both"/>
-        <w:textAlignment w:val="baseline"/>
-      </w:pPr>
     </w:p>
     <w:p>
       <w:pPr>
@@ -5698,27 +5653,11 @@
           <w:rFonts w:eastAsia="Arial"/>
         </w:rPr>
       </w:pPr>
-      <w:bookmarkStart w:id="8" w:name="_Toc40695503"/>
-      <w:proofErr w:type="spellStart"/>
       <w:r>
         <w:rPr>
           <w:rFonts w:eastAsia="Arial"/>
         </w:rPr>
-        <w:t>Sub-tópico</w:t>
-      </w:r>
-      <w:proofErr w:type="spellEnd"/>
-      <w:r>
-        <w:rPr>
-          <w:rFonts w:eastAsia="Arial"/>
-        </w:rPr>
-        <w:t xml:space="preserve"> se necessário</w:t>
-      </w:r>
-      <w:bookmarkEnd w:id="8"/>
-      <w:r>
-        <w:rPr>
-          <w:rFonts w:eastAsia="Arial"/>
-        </w:rPr>
-        <w:t xml:space="preserve"> </w:t>
+        <w:t>Educação Infantil e Tecnologias Digitais</w:t>
       </w:r>
     </w:p>
     <w:p>
@@ -5732,9 +5671,6 @@
         <w:jc w:val="both"/>
         <w:textAlignment w:val="baseline"/>
       </w:pPr>
-      <w:r>
-        <w:t>A Fundamentação Teórica é a parte do TCC destinada a apresentar e discutir os principais conceitos, teorias e estudos já produzidos sobre o tema investigado. Trata-se do momento em que o pesquisador demonstra domínio do conhecimento científico existente e constrói a base conceitual que sustentará sua análise. Diferentemente da introdução, que apresenta o problema e os objetivos do estudo, a fundamentação teórica aprofunda o debate acadêmico, mostrando como outros autores abordaram a temática e quais contribuições já foram consolidadas na literatura.</w:t>
-      </w:r>
     </w:p>
     <w:p>
       <w:pPr>
@@ -5742,6 +5678,60 @@
         <w:textAlignment w:val="baseline"/>
       </w:pPr>
       <w:r>
+        <w:t xml:space="preserve">Permeio a décadas históricas do Passado, a socialização na educação infantil era comprometida como uma gradativa inclusão dos sujeitos na sociedade, </w:t>
+      </w:r>
+      <w:r>
+        <w:t>[...] quando se observam os fatos tais como são e tais como sempre foram, salta aos olhos que toda educação consiste num esforço contínuo para impor à criança maneiras de ver, de sentir e de agir às quais ela não teria chegado espontaneamente</w:t>
+      </w:r>
+      <w:r>
+        <w:t xml:space="preserve"> (DURKHEIM, 2007 apud SANTOS, 2020, p.7)</w:t>
+      </w:r>
+      <w:r>
+        <w:t xml:space="preserve">. </w:t>
+      </w:r>
+      <w:r>
+        <w:t xml:space="preserve">Segundo </w:t>
+      </w:r>
+      <w:proofErr w:type="gramStart"/>
+      <w:r>
+        <w:t>Santos</w:t>
+      </w:r>
+      <w:r>
+        <w:t>(</w:t>
+      </w:r>
+      <w:proofErr w:type="gramEnd"/>
+      <w:r>
+        <w:t>2016)</w:t>
+      </w:r>
+      <w:r>
+        <w:t xml:space="preserve"> “[...] as crianças são consideradas seres sociais mergulhados, desde cedo, em uma rede social já constituída[...]” </w:t>
+      </w:r>
+    </w:p>
+    <w:p>
+      <w:pPr>
+        <w:jc w:val="both"/>
+        <w:textAlignment w:val="baseline"/>
+      </w:pPr>
+    </w:p>
+    <w:p>
+      <w:pPr>
+        <w:jc w:val="both"/>
+        <w:textAlignment w:val="baseline"/>
+      </w:pPr>
+      <w:r>
+        <w:t xml:space="preserve">A Fundamentação Teórica é a parte do TCC destinada a apresentar e discutir os principais conceitos, teorias e estudos já produzidos sobre o tema investigado. Trata-se do momento em que o pesquisador demonstra domínio do conhecimento científico existente e constrói a base conceitual que sustentará sua análise. Diferentemente da introdução, que apresenta o problema e os objetivos do estudo, a fundamentação teórica aprofunda o debate acadêmico, mostrando como outros </w:t>
+      </w:r>
+      <w:r>
+        <w:lastRenderedPageBreak/>
+        <w:t>autores abordaram a temática e quais contribuições já foram consolidadas na literatura.</w:t>
+      </w:r>
+    </w:p>
+    <w:p>
+      <w:pPr>
+        <w:jc w:val="both"/>
+        <w:textAlignment w:val="baseline"/>
+      </w:pPr>
+      <w:r>
         <w:t>Essa seção tem como principal finalidade situar o trabalho dentro do campo científico, evitando que a pesquisa seja construída apenas com opiniões pessoais ou percepções empíricas. Ao dialogar com autores reconhecidos, o pesquisador fundamenta suas escolhas conceituais e metodológicas, evidenciando que seu estudo está alinhado com o desenvolvimento teórico da área. A fundamentação também ajuda a identificar lacunas existentes, reforçando a necessidade e a originalidade da investigação proposta.</w:t>
       </w:r>
     </w:p>
@@ -5751,7 +5741,6 @@
         <w:textAlignment w:val="baseline"/>
       </w:pPr>
       <w:r>
-        <w:lastRenderedPageBreak/>
         <w:t>Na prática, a fundamentação teórica é composta por uma organização lógica de tópicos e subtópicos que tratam dos conceitos centrais do trabalho. Por exemplo, se o tema envolve tecnologia e educação, podem ser discutidos conceitos como inovação tecnológica, metodologias ativas, aprendizagem digital e cultura digital. Cada tópico deve apresentar definições, comparações entre autores, convergências e divergências teóricas, sempre com citações adequadas conforme as normas acadêmicas vigentes.</w:t>
       </w:r>
     </w:p>
@@ -5802,25 +5791,38 @@
         <w:pStyle w:val="Legenda"/>
         <w:jc w:val="center"/>
       </w:pPr>
-      <w:bookmarkStart w:id="9" w:name="_Toc82636016"/>
-      <w:bookmarkStart w:id="10" w:name="_Toc131144883"/>
+      <w:bookmarkStart w:id="8" w:name="_Toc82636016"/>
+      <w:bookmarkStart w:id="9" w:name="_Toc131144883"/>
       <w:r>
         <w:t xml:space="preserve">Figura </w:t>
       </w:r>
-      <w:fldSimple w:instr=" SEQ Figura \* ARABIC ">
-        <w:r>
-          <w:rPr>
-            <w:noProof/>
-          </w:rPr>
-          <w:t>1</w:t>
-        </w:r>
-      </w:fldSimple>
+      <w:r>
+        <w:fldChar w:fldCharType="begin"/>
+      </w:r>
+      <w:r>
+        <w:instrText xml:space="preserve"> SEQ Figura \* ARABIC </w:instrText>
+      </w:r>
+      <w:r>
+        <w:fldChar w:fldCharType="separate"/>
+      </w:r>
+      <w:r>
+        <w:rPr>
+          <w:noProof/>
+        </w:rPr>
+        <w:t>1</w:t>
+      </w:r>
+      <w:r>
+        <w:rPr>
+          <w:noProof/>
+        </w:rPr>
+        <w:fldChar w:fldCharType="end"/>
+      </w:r>
       <w:r>
         <w:t xml:space="preserve"> - exemplo de figura</w:t>
       </w:r>
     </w:p>
+    <w:bookmarkEnd w:id="8"/>
     <w:bookmarkEnd w:id="9"/>
-    <w:bookmarkEnd w:id="10"/>
     <w:p>
       <w:pPr>
         <w:ind w:firstLine="0"/>
@@ -5831,7 +5833,6 @@
         <w:rPr>
           <w:noProof/>
         </w:rPr>
-        <w:lastRenderedPageBreak/>
         <w:drawing>
           <wp:inline distT="0" distB="0" distL="0" distR="0" wp14:anchorId="273253E2" wp14:editId="10687C4F">
             <wp:extent cx="5076825" cy="2854350"/>
@@ -5953,7 +5954,7 @@
           <w:rFonts w:eastAsia="Arial"/>
         </w:rPr>
       </w:pPr>
-      <w:bookmarkStart w:id="11" w:name="_Toc40695504"/>
+      <w:bookmarkStart w:id="10" w:name="_Toc40695504"/>
       <w:proofErr w:type="spellStart"/>
       <w:r>
         <w:rPr>
@@ -5968,7 +5969,7 @@
         </w:rPr>
         <w:t xml:space="preserve"> se necessário</w:t>
       </w:r>
-      <w:bookmarkEnd w:id="11"/>
+      <w:bookmarkEnd w:id="10"/>
       <w:r>
         <w:rPr>
           <w:rFonts w:eastAsia="Arial"/>
@@ -6151,7 +6152,7 @@
           <w:rFonts w:eastAsia="Arial"/>
         </w:rPr>
       </w:pPr>
-      <w:bookmarkStart w:id="12" w:name="_Toc40695506"/>
+      <w:bookmarkStart w:id="11" w:name="_Toc40695506"/>
       <w:proofErr w:type="spellStart"/>
       <w:r>
         <w:rPr>
@@ -6166,7 +6167,7 @@
         </w:rPr>
         <w:t xml:space="preserve"> se necessário</w:t>
       </w:r>
-      <w:bookmarkEnd w:id="12"/>
+      <w:bookmarkEnd w:id="11"/>
       <w:r>
         <w:rPr>
           <w:rFonts w:eastAsia="Arial"/>
@@ -6226,8 +6227,8 @@
         <w:ind w:firstLine="0"/>
         <w:jc w:val="center"/>
       </w:pPr>
-      <w:bookmarkStart w:id="13" w:name="_Toc82636017"/>
-      <w:bookmarkStart w:id="14" w:name="_Toc131144884"/>
+      <w:bookmarkStart w:id="12" w:name="_Toc82636017"/>
+      <w:bookmarkStart w:id="13" w:name="_Toc131144884"/>
       <w:r>
         <w:rPr>
           <w:b/>
@@ -6287,8 +6288,8 @@
       <w:r>
         <w:t>2</w:t>
       </w:r>
+      <w:bookmarkEnd w:id="12"/>
       <w:bookmarkEnd w:id="13"/>
-      <w:bookmarkEnd w:id="14"/>
     </w:p>
     <w:p>
       <w:pPr>
@@ -6395,8 +6396,8 @@
         <w:pStyle w:val="Legenda"/>
         <w:jc w:val="center"/>
       </w:pPr>
-      <w:bookmarkStart w:id="15" w:name="_Toc82636018"/>
-      <w:bookmarkStart w:id="16" w:name="_Toc131144885"/>
+      <w:bookmarkStart w:id="14" w:name="_Toc82636018"/>
+      <w:bookmarkStart w:id="15" w:name="_Toc131144885"/>
       <w:r>
         <w:rPr>
           <w:b/>
@@ -6456,8 +6457,8 @@
       <w:r>
         <w:t>3</w:t>
       </w:r>
+      <w:bookmarkEnd w:id="14"/>
       <w:bookmarkEnd w:id="15"/>
-      <w:bookmarkEnd w:id="16"/>
     </w:p>
     <w:p>
       <w:pPr>
@@ -6571,7 +6572,7 @@
           <w:rFonts w:eastAsia="Arial"/>
         </w:rPr>
       </w:pPr>
-      <w:bookmarkStart w:id="17" w:name="_Toc40695507"/>
+      <w:bookmarkStart w:id="16" w:name="_Toc40695507"/>
       <w:proofErr w:type="spellStart"/>
       <w:r>
         <w:rPr>
@@ -6586,7 +6587,7 @@
         </w:rPr>
         <w:t xml:space="preserve"> se necessário</w:t>
       </w:r>
-      <w:bookmarkEnd w:id="17"/>
+      <w:bookmarkEnd w:id="16"/>
       <w:r>
         <w:rPr>
           <w:rFonts w:eastAsia="Arial"/>
@@ -6721,7 +6722,7 @@
           <w:rFonts w:eastAsia="Arial"/>
         </w:rPr>
       </w:pPr>
-      <w:bookmarkStart w:id="18" w:name="_Toc40695509"/>
+      <w:bookmarkStart w:id="17" w:name="_Toc40695509"/>
       <w:proofErr w:type="spellStart"/>
       <w:r>
         <w:rPr>
@@ -6742,7 +6743,7 @@
         </w:rPr>
         <w:t>1</w:t>
       </w:r>
-      <w:bookmarkEnd w:id="18"/>
+      <w:bookmarkEnd w:id="17"/>
       <w:r>
         <w:rPr>
           <w:rFonts w:eastAsia="Arial"/>
@@ -6815,8 +6816,8 @@
         <w:ind w:firstLine="0"/>
         <w:jc w:val="center"/>
       </w:pPr>
-      <w:bookmarkStart w:id="19" w:name="_Toc82636019"/>
-      <w:bookmarkStart w:id="20" w:name="_Toc131144886"/>
+      <w:bookmarkStart w:id="18" w:name="_Toc82636019"/>
+      <w:bookmarkStart w:id="19" w:name="_Toc131144886"/>
       <w:r>
         <w:rPr>
           <w:b/>
@@ -6870,8 +6871,8 @@
       <w:r>
         <w:t>3</w:t>
       </w:r>
+      <w:bookmarkEnd w:id="18"/>
       <w:bookmarkEnd w:id="19"/>
-      <w:bookmarkEnd w:id="20"/>
     </w:p>
     <w:p>
       <w:pPr>
@@ -6983,8 +6984,8 @@
         <w:ind w:firstLine="0"/>
         <w:jc w:val="center"/>
       </w:pPr>
-      <w:bookmarkStart w:id="21" w:name="_Toc82636020"/>
-      <w:bookmarkStart w:id="22" w:name="_Toc131144887"/>
+      <w:bookmarkStart w:id="20" w:name="_Toc82636020"/>
+      <w:bookmarkStart w:id="21" w:name="_Toc131144887"/>
       <w:r>
         <w:rPr>
           <w:b/>
@@ -7037,8 +7038,8 @@
       <w:r>
         <w:t>4</w:t>
       </w:r>
+      <w:bookmarkEnd w:id="20"/>
       <w:bookmarkEnd w:id="21"/>
-      <w:bookmarkEnd w:id="22"/>
     </w:p>
     <w:p>
       <w:pPr>
@@ -7166,7 +7167,7 @@
           <w:rFonts w:eastAsia="Arial"/>
         </w:rPr>
       </w:pPr>
-      <w:bookmarkStart w:id="23" w:name="_Toc40695510"/>
+      <w:bookmarkStart w:id="22" w:name="_Toc40695510"/>
       <w:proofErr w:type="spellStart"/>
       <w:r>
         <w:rPr>
@@ -7187,7 +7188,7 @@
         </w:rPr>
         <w:t>2</w:t>
       </w:r>
-      <w:bookmarkEnd w:id="23"/>
+      <w:bookmarkEnd w:id="22"/>
     </w:p>
     <w:p>
       <w:pPr>
@@ -7260,7 +7261,7 @@
           <w:rFonts w:eastAsia="Arial"/>
         </w:rPr>
       </w:pPr>
-      <w:bookmarkStart w:id="24" w:name="_Toc40695511"/>
+      <w:bookmarkStart w:id="23" w:name="_Toc40695511"/>
       <w:proofErr w:type="spellStart"/>
       <w:r>
         <w:rPr>
@@ -7268,7 +7269,7 @@
         </w:rPr>
         <w:t>Sub-tópico</w:t>
       </w:r>
-      <w:bookmarkEnd w:id="24"/>
+      <w:bookmarkEnd w:id="23"/>
       <w:proofErr w:type="spellEnd"/>
       <w:r>
         <w:rPr>
@@ -7376,7 +7377,7 @@
         <w:pStyle w:val="Legenda"/>
         <w:ind w:firstLine="0"/>
       </w:pPr>
-      <w:bookmarkStart w:id="25" w:name="_Toc40696614"/>
+      <w:bookmarkStart w:id="24" w:name="_Toc40696614"/>
       <w:r>
         <w:rPr>
           <w:b/>
@@ -7423,7 +7424,7 @@
       <w:r>
         <w:t xml:space="preserve"> - Tipos de XXXXXXXXX</w:t>
       </w:r>
-      <w:bookmarkEnd w:id="25"/>
+      <w:bookmarkEnd w:id="24"/>
     </w:p>
     <w:tbl>
       <w:tblPr>
@@ -7733,7 +7734,7 @@
         <w:pStyle w:val="Legenda"/>
         <w:ind w:firstLine="0"/>
       </w:pPr>
-      <w:bookmarkStart w:id="26" w:name="_Toc40696615"/>
+      <w:bookmarkStart w:id="25" w:name="_Toc40696615"/>
       <w:r>
         <w:rPr>
           <w:b/>
@@ -7783,7 +7784,7 @@
       <w:r>
         <w:t>Tipos de XXXXXXXXX</w:t>
       </w:r>
-      <w:bookmarkEnd w:id="26"/>
+      <w:bookmarkEnd w:id="25"/>
     </w:p>
     <w:tbl>
       <w:tblPr>
@@ -8337,8 +8338,8 @@
           <w:szCs w:val="24"/>
         </w:rPr>
       </w:pPr>
-      <w:bookmarkStart w:id="27" w:name="_Toc37240860"/>
-      <w:bookmarkStart w:id="28" w:name="_Toc40695515"/>
+      <w:bookmarkStart w:id="26" w:name="_Toc37240860"/>
+      <w:bookmarkStart w:id="27" w:name="_Toc40695515"/>
       <w:r>
         <w:rPr>
           <w:rFonts w:eastAsiaTheme="majorEastAsia" w:cs="Arial"/>
@@ -8583,8 +8584,8 @@
         </w:rPr>
         <w:t>criados pelo autor)</w:t>
       </w:r>
+      <w:bookmarkEnd w:id="26"/>
       <w:bookmarkEnd w:id="27"/>
-      <w:bookmarkEnd w:id="28"/>
     </w:p>
     <w:p>
       <w:pPr>
@@ -8599,8 +8600,8 @@
           <w:szCs w:val="24"/>
         </w:rPr>
       </w:pPr>
-      <w:bookmarkStart w:id="29" w:name="_Toc37240861"/>
-      <w:bookmarkStart w:id="30" w:name="_Toc40695516"/>
+      <w:bookmarkStart w:id="28" w:name="_Toc37240861"/>
+      <w:bookmarkStart w:id="29" w:name="_Toc40695516"/>
       <w:r>
         <w:rPr>
           <w:rFonts w:eastAsiaTheme="majorEastAsia" w:cs="Arial"/>
@@ -8631,8 +8632,8 @@
         </w:rPr>
         <w:t>(não criados pelo autor)</w:t>
       </w:r>
+      <w:bookmarkEnd w:id="28"/>
       <w:bookmarkEnd w:id="29"/>
-      <w:bookmarkEnd w:id="30"/>
     </w:p>
     <w:p/>
     <w:p/>
@@ -10978,7 +10979,7 @@
 </file>
 
 <file path=customXml/itemProps1.xml><?xml version="1.0" encoding="utf-8"?>
-<ds:datastoreItem xmlns:ds="http://schemas.openxmlformats.org/officeDocument/2006/customXml" ds:itemID="{C1D63143-CB49-4123-87A3-EFA33E629BD4}">
+<ds:datastoreItem xmlns:ds="http://schemas.openxmlformats.org/officeDocument/2006/customXml" ds:itemID="{D567ABDB-B5E8-44DB-95EA-A8842958DBBE}">
   <ds:schemaRefs>
     <ds:schemaRef ds:uri="http://schemas.openxmlformats.org/officeDocument/2006/bibliography"/>
   </ds:schemaRefs>

</xml_diff>